<commit_message>
Añadir distribución de 32 bits y verificar los ejecutables x86
</commit_message>
<xml_diff>
--- a/docs/technical-guide.docx
+++ b/docs/technical-guide.docx
@@ -553,7 +553,7 @@
     </w:p>
     <w:p>
       <w:r>
-        <w:t>Both projects target net9.0-windows with Windows Forms enabled. The desktop OutputType is WinExe; the CLI OutputType is Exe, so it retains terminal output. Development requires the .NET 9 SDK on Windows. The published win-x64 delivery includes its runtime and does not require the SDK or a separate .NET installation on the customer's PC.</w:t>
+        <w:t>Both projects target net9.0-windows with Windows Forms enabled. The desktop OutputType is WinExe; the CLI OutputType is Exe, so it retains terminal output. Development requires the .NET 9 SDK on Windows. Self-contained distributions include their architecture-specific runtime and do not require the SDK or a separate .NET installation on the customer's PC. The additional win-x86 package provides native 32-bit executables and runtime, retaining the first distribution's application behavior. A win-x64 executable cannot run on 32-bit Windows.</w:t>
       </w:r>
     </w:p>
     <w:p>
@@ -3934,7 +3934,21 @@
     </w:p>
     <w:p>
       <w:r>
-        <w:t>The script uses self-contained Release publishing, defaults to win-x64, optionally accepts win-arm64, checks publish exit codes, copies two EXEs plus example/README, compresses a ZIP, and prints SHA256. It creates unique directories instead of deleting prior releases. Intermediate output is under ignored downloads/release-builds; releases are under ignored dist. Native runtime components may extract on launch. Only win-x64 was verified for the retained package.</w:t>
+        <w:t>The script uses self-contained Release publishing, defaults to win-x64, accepts win-x86 and win-arm64, checks publish exit codes, copies two EXEs plus example/README, compresses a ZIP, and prints SHA256. It creates unique directories instead of deleting prior releases. Intermediate output is under ignored downloads/release-builds; releases are under ignored dist. Native runtime components may extract on launch. The original package's verification described above was on win-x64; architecture-specific verification is recorded separately in verificacion.md.</w:t>
+      </w:r>
+    </w:p>
+    <w:p>
+      <w:r>
+        <w:t>To publish the 32-bit desktop and CLI with the x86 runtime:</w:t>
+      </w:r>
+    </w:p>
+    <w:p>
+      <w:pPr>
+        <w:pStyle w:val="CodeBlock"/>
+        <w:shd w:fill="F2F4F7"/>
+      </w:pPr>
+      <w:r>
+        <w:t>powershell -NoProfile -ExecutionPolicy Bypass -File ./scripts/publish_windows.ps1 -Runtime win-x86</w:t>
       </w:r>
     </w:p>
     <w:p>

</xml_diff>

<commit_message>
Eliminar referencias a los tres documentos retirados
</commit_message>
<xml_diff>
--- a/docs/technical-guide.docx
+++ b/docs/technical-guide.docx
@@ -3971,25 +3971,14 @@
     </w:p>
     <w:p>
       <w:r>
-        <w:t xml:space="preserve">Automatic installation requires the real Tytan entry point, required arguments/paths, runtime behavior, success/failure signal, and ownership of installed-version updates. DownloadAsync's verified path can feed that confirmed mechanism. A completed download, a launched executable, or a closed installer window alone must not be treated as installation success. See </w:t>
-      </w:r>
-      <w:hyperlink r:id="rId10">
-        <w:r>
-          <w:rPr>
-            <w:rStyle w:val="Hyperlink"/>
-          </w:rPr>
-          <w:t>installation contract</w:t>
-        </w:r>
-      </w:hyperlink>
-      <w:r>
-        <w:t>.</w:t>
+        <w:t>Automatic installation requires the real Tytan entry point, required arguments/paths, runtime behavior, success/failure signal, and ownership of installed-version updates. DownloadAsync's verified path can feed that confirmed mechanism. A completed download, a launched executable, or a closed installer window alone must not be treated as installation success.</w:t>
       </w:r>
     </w:p>
     <w:p>
       <w:r>
         <w:t xml:space="preserve">For end-user instructions, see </w:t>
       </w:r>
-      <w:hyperlink r:id="rId11">
+      <w:hyperlink r:id="rId10">
         <w:r>
           <w:rPr>
             <w:rStyle w:val="Hyperlink"/>
@@ -4000,7 +3989,7 @@
       <w:r>
         <w:t xml:space="preserve">. For the PHP-specific walkthrough with additional endpoint excerpts, see </w:t>
       </w:r>
-      <w:hyperlink r:id="rId12">
+      <w:hyperlink r:id="rId11">
         <w:r>
           <w:rPr>
             <w:rStyle w:val="Hyperlink"/>
@@ -4011,7 +4000,7 @@
       <w:r>
         <w:t xml:space="preserve">. Deployment details remain in </w:t>
       </w:r>
-      <w:hyperlink r:id="rId13">
+      <w:hyperlink r:id="rId12">
         <w:r>
           <w:rPr>
             <w:rStyle w:val="Hyperlink"/>
@@ -4024,8 +4013,8 @@
       </w:r>
     </w:p>
     <w:sectPr>
-      <w:headerReference w:type="default" r:id="rId14"/>
-      <w:footerReference w:type="default" r:id="rId15"/>
+      <w:headerReference w:type="default" r:id="rId13"/>
+      <w:footerReference w:type="default" r:id="rId14"/>
       <w:pgSz w:w="11906" w:h="16838"/>
       <w:pgMar w:top="1134" w:right="1020" w:bottom="1134" w:left="1020" w:header="720" w:footer="720" w:gutter="0"/>
       <w:cols w:space="720"/>

</xml_diff>

<commit_message>
Actualizar los README y retirar referencias a documentación eliminada
</commit_message>
<xml_diff>
--- a/docs/technical-guide.docx
+++ b/docs/technical-guide.docx
@@ -3871,18 +3871,7 @@
     <w:p/>
     <w:p>
       <w:r>
-        <w:t xml:space="preserve">The PHP harness independently launches actual temporary PHP servers, creates owned ZIP fixtures, exercises endpoints/configuration failures, and cleans up. See </w:t>
-      </w:r>
-      <w:hyperlink r:id="rId9">
-        <w:r>
-          <w:rPr>
-            <w:rStyle w:val="Hyperlink"/>
-          </w:rPr>
-          <w:t>verification history</w:t>
-        </w:r>
-      </w:hyperlink>
-      <w:r>
-        <w:t xml:space="preserve"> for historical PHP runtime results. A server-only test run needs Python and PHP, not .NET.</w:t>
+        <w:t>The PHP harness independently launches actual temporary PHP servers, creates owned ZIP fixtures, exercises endpoints/configuration failures, and cleans up. A server-only test run needs Python and PHP, not .NET.</w:t>
       </w:r>
     </w:p>
     <w:p>
@@ -3934,7 +3923,7 @@
     </w:p>
     <w:p>
       <w:r>
-        <w:t>The script uses self-contained Release publishing, defaults to win-x64, accepts win-x86 and win-arm64, checks publish exit codes, copies two EXEs plus example/README, compresses a ZIP, and prints SHA256. It creates unique directories instead of deleting prior releases. Intermediate output is under ignored downloads/release-builds; releases are under ignored dist. Native runtime components may extract on launch. The original package's verification described above was on win-x64; architecture-specific verification is recorded separately in verificacion.md.</w:t>
+        <w:t>The script uses self-contained Release publishing, defaults to win-x64, accepts win-x86 and win-arm64, checks publish exit codes, copies two EXEs plus example/README, compresses a ZIP, and prints SHA256. It creates unique directories instead of deleting prior releases. Intermediate output is under ignored downloads/release-builds; releases are under ignored dist. Native runtime components may extract on launch. The original package's verification described above was on win-x64; the win-x86 package also passed all 91 Windows checks under WOW64 on the development computer. Acceptance testing on a customer computer running 32-bit Windows remains pending.</w:t>
       </w:r>
     </w:p>
     <w:p>
@@ -3978,7 +3967,7 @@
       <w:r>
         <w:t xml:space="preserve">For end-user instructions, see </w:t>
       </w:r>
-      <w:hyperlink r:id="rId10">
+      <w:hyperlink r:id="rId9">
         <w:r>
           <w:rPr>
             <w:rStyle w:val="Hyperlink"/>
@@ -3989,7 +3978,7 @@
       <w:r>
         <w:t xml:space="preserve">. For the PHP-specific walkthrough with additional endpoint excerpts, see </w:t>
       </w:r>
-      <w:hyperlink r:id="rId11">
+      <w:hyperlink r:id="rId10">
         <w:r>
           <w:rPr>
             <w:rStyle w:val="Hyperlink"/>
@@ -4000,7 +3989,7 @@
       <w:r>
         <w:t xml:space="preserve">. Deployment details remain in </w:t>
       </w:r>
-      <w:hyperlink r:id="rId12">
+      <w:hyperlink r:id="rId11">
         <w:r>
           <w:rPr>
             <w:rStyle w:val="Hyperlink"/>
@@ -4013,8 +4002,8 @@
       </w:r>
     </w:p>
     <w:sectPr>
-      <w:headerReference w:type="default" r:id="rId13"/>
-      <w:footerReference w:type="default" r:id="rId14"/>
+      <w:headerReference w:type="default" r:id="rId12"/>
+      <w:footerReference w:type="default" r:id="rId13"/>
       <w:pgSz w:w="11906" w:h="16838"/>
       <w:pgMar w:top="1134" w:right="1020" w:bottom="1134" w:left="1020" w:header="720" w:footer="720" w:gutter="0"/>
       <w:cols w:space="720"/>

</xml_diff>